<commit_message>
feat: add pan-tilt and servo test projects, fix Pi-Nano floating pin issues
Adds standalone Nano firmware for laser toggle, servo up/down, and a
Pi->Nano servo bridge, plus a Pi-native pan-tilt/laser script. Fixes
floating D2/D9 input pins on the Nano side with INPUT_PULLUP so idle
signal lines hold a defined state instead of picking up noise.
</commit_message>
<xml_diff>
--- a/pi-nano-laser/Pi-Nano-Laser-Setup.docx
+++ b/pi-nano-laser/Pi-Nano-Laser-Setup.docx
@@ -68,14 +68,7 @@
           <w:i/>
           <w:sz w:val="18"/>
         </w:rPr>
-        <w:t xml:space="preserve">Figure 1. Raspberry Pi GPIO12 (physical pin 32) signals Arduino Nano D2; shared ground (Pi pin 6 → Nano GND) gives the signal a common reference; Nano D6 </w:t>
-      </w:r>
-      <w:r>
-        <w:rPr>
-          <w:i/>
-          <w:sz w:val="18"/>
-        </w:rPr>
-        <w:t>relays the on/off state directly to the laser module's PWM pin.</w:t>
+        <w:t>Figure 1. Raspberry Pi GPIO12 (physical pin 32) signals Arduino Nano D2; shared ground (Pi pin 6 → Nano GND) gives the signal a common reference; Nano D6 relays the on/off state directly to the laser module's PWM pin.</w:t>
       </w:r>
     </w:p>
     <w:p>
@@ -86,21 +79,12 @@
         <w:rPr>
           <w:color w:val="000000"/>
         </w:rPr>
-        <w:t>G</w:t>
-      </w:r>
-      <w:r>
-        <w:rPr>
-          <w:color w:val="000000"/>
-        </w:rPr>
-        <w:t>oal</w:t>
+        <w:t>Goal</w:t>
       </w:r>
     </w:p>
     <w:p>
       <w:r>
-        <w:t xml:space="preserve">The Raspberry Pi runs a YOLOv8 person-detection model on the live camera feed. When a person is detected in frame, the laser should turn on; when no person has been </w:t>
-      </w:r>
-      <w:r>
-        <w:t>visible for a few seconds, the laser should turn off. The Nano acts as the relay between the Pi's detection result and the physical laser hardware.</w:t>
+        <w:t>The Raspberry Pi runs a YOLOv8 person-detection model on the live camera feed. When a person is detected in frame, the laser should turn on; when no person has been visible for a few seconds, the laser should turn off. The Nano acts as the relay between the Pi's detection result and the physical laser hardware.</w:t>
       </w:r>
     </w:p>
     <w:p>
@@ -246,13 +230,7 @@
               <w:rPr>
                 <w:color w:val="000000"/>
               </w:rPr>
-              <w:t>Common ground referenc</w:t>
-            </w:r>
-            <w:r>
-              <w:rPr>
-                <w:color w:val="000000"/>
-              </w:rPr>
-              <w:t>e</w:t>
+              <w:t>Common ground reference</w:t>
             </w:r>
           </w:p>
         </w:tc>
@@ -376,13 +354,7 @@
       </w:pPr>
       <w:r>
         <w:lastRenderedPageBreak/>
-        <w:t xml:space="preserve">1. </w:t>
-      </w:r>
-      <w:r>
-        <w:t>The MOSFET's signal wire was initially connected to phy</w:t>
-      </w:r>
-      <w:r>
-        <w:t>sical pin 28 (GPIO1), which is reserved by the Pi for HAT ID EEPROM detection and cannot be driven reliably as a general-purpose output — confirmed when the pin stayed pinned near 3.3V</w:t>
+        <w:t>1. The MOSFET's signal wire was initially connected to physical pin 28 (GPIO1), which is reserved by the Pi for HAT ID EEPROM detection and cannot be driven reliably as a general-purpose output — confirmed when the pin stayed pinned near 3.3V</w:t>
       </w:r>
       <w:r>
         <w:t xml:space="preserve"> regardless of commanded state.</w:t>
@@ -408,18 +380,12 @@
         <w:ind w:left="360" w:hanging="360"/>
       </w:pPr>
       <w:r>
-        <w:t>2. After moving to a proper GPIO (GPIO12</w:t>
-      </w:r>
-      <w:r>
-        <w:t>, pin 32), a multimeter check showed only ~0.86V across the MOSFET's load terminals while "on" (expected close to the full 12V) — the Pi's 3.3V logic level was not enough to fully saturate the IRF520N's gate, so the MOSFET never switched cleanly.</w:t>
+        <w:t>2. After moving to a proper GPIO (GPIO12, pin 32), a multimeter check showed only ~0.86V across the MOSFET's load terminals while "on" (expected close to the full 12V) — the Pi's 3.3V logic level was not enough to fully saturate the IRF520N's gate, so the MOSFET never switched cleanly.</w:t>
       </w:r>
     </w:p>
     <w:p>
       <w:r>
-        <w:t>Rather th</w:t>
-      </w:r>
-      <w:r>
-        <w:t>an adding a gate-driver stage to fix the MOSFET path, the simpler direct-relay approach was tried instead: the Nano reads the Pi's signal on D2 and mirrors it straight onto a PWM-capable output pin wired to the laser.</w:t>
+        <w:t>Rather than adding a gate-driver stage to fix the MOSFET path, the simpler direct-relay approach was tried instead: the Nano reads the Pi's signal on D2 and mirrors it straight onto a PWM-capable output pin wired to the laser.</w:t>
       </w:r>
     </w:p>
     <w:p>
@@ -430,15 +396,7 @@
         <w:rPr>
           <w:color w:val="000000"/>
         </w:rPr>
-        <w:t>Final Working Setu</w:t>
-      </w:r>
-      <w:bookmarkStart w:id="0" w:name="_GoBack"/>
-      <w:bookmarkEnd w:id="0"/>
-      <w:r>
-        <w:rPr>
-          <w:color w:val="000000"/>
-        </w:rPr>
-        <w:t>p</w:t>
+        <w:t>Final Working Setup</w:t>
       </w:r>
     </w:p>
     <w:p>
@@ -461,16 +419,132 @@
         <w:t xml:space="preserve">pinctrl set 12 op dl </w:t>
       </w:r>
       <w:r>
-        <w:t>a few seconds after th</w:t>
-      </w:r>
-      <w:r>
-        <w:t>e person leaves frame — triggered only on state change, not every frame, so the detection loop isn't slowed down by redundant GPIO calls. The Nano relays that state from D2 to D6 in real time, and D6 drives the laser directly. This chain has been tested en</w:t>
-      </w:r>
-      <w:r>
-        <w:t>d-to-end and confirmed working.</w:t>
+        <w:t>a few seconds after the person leaves frame — triggered only on state change, not every frame, so the detection loop isn't slowed down by redundant GPIO calls. The Nano relays that state from D2 to D6 in real time, and D6 drives the laser directly. This chain has been tested end-to-end and confirmed working.</w:t>
       </w:r>
     </w:p>
-    <w:p/>
+    <w:p>
+      <w:pPr>
+        <w:pStyle w:val="Heading2"/>
+        <w:rPr>
+          <w:color w:val="000000" w:themeColor="text1"/>
+        </w:rPr>
+      </w:pPr>
+      <w:r>
+        <w:rPr>
+          <w:color w:val="000000" w:themeColor="text1"/>
+        </w:rPr>
+        <w:t>Power Requirements</w:t>
+      </w:r>
+    </w:p>
+    <w:tbl>
+      <w:tblPr>
+        <w:tblStyle w:val="TableGrid"/>
+        <w:tblW w:w="0" w:type="auto"/>
+        <w:tblLook w:val="04A0" w:firstRow="1" w:lastRow="0" w:firstColumn="1" w:lastColumn="0" w:noHBand="0" w:noVBand="1"/>
+      </w:tblPr>
+      <w:tblGrid>
+        <w:gridCol w:w="4320"/>
+        <w:gridCol w:w="4320"/>
+      </w:tblGrid>
+      <w:tr>
+        <w:tc>
+          <w:tcPr>
+            <w:tcW w:w="4320" w:type="dxa"/>
+          </w:tcPr>
+          <w:p>
+            <w:r>
+              <w:t>Component</w:t>
+            </w:r>
+          </w:p>
+        </w:tc>
+        <w:tc>
+          <w:tcPr>
+            <w:tcW w:w="4320" w:type="dxa"/>
+          </w:tcPr>
+          <w:p>
+            <w:r>
+              <w:t>Voltage</w:t>
+            </w:r>
+          </w:p>
+        </w:tc>
+      </w:tr>
+      <w:tr>
+        <w:tc>
+          <w:tcPr>
+            <w:tcW w:w="4320" w:type="dxa"/>
+          </w:tcPr>
+          <w:p>
+            <w:r>
+              <w:t>Raspberry Pi + Pi HAT</w:t>
+            </w:r>
+          </w:p>
+        </w:tc>
+        <w:tc>
+          <w:tcPr>
+            <w:tcW w:w="4320" w:type="dxa"/>
+          </w:tcPr>
+          <w:p>
+            <w:r>
+              <w:t>5V</w:t>
+            </w:r>
+          </w:p>
+        </w:tc>
+      </w:tr>
+      <w:tr>
+        <w:tc>
+          <w:tcPr>
+            <w:tcW w:w="4320" w:type="dxa"/>
+          </w:tcPr>
+          <w:p>
+            <w:r>
+              <w:t>Arduino Nano</w:t>
+            </w:r>
+          </w:p>
+        </w:tc>
+        <w:tc>
+          <w:tcPr>
+            <w:tcW w:w="4320" w:type="dxa"/>
+          </w:tcPr>
+          <w:p>
+            <w:r>
+              <w:t>5V</w:t>
+            </w:r>
+          </w:p>
+        </w:tc>
+      </w:tr>
+      <w:tr>
+        <w:tc>
+          <w:tcPr>
+            <w:tcW w:w="4320" w:type="dxa"/>
+          </w:tcPr>
+          <w:p>
+            <w:r>
+              <w:t>Laser module</w:t>
+            </w:r>
+          </w:p>
+        </w:tc>
+        <w:tc>
+          <w:tcPr>
+            <w:tcW w:w="4320" w:type="dxa"/>
+          </w:tcPr>
+          <w:p>
+            <w:r>
+              <w:t>12V</w:t>
+            </w:r>
+          </w:p>
+        </w:tc>
+      </w:tr>
+    </w:tbl>
+    <w:p>
+      <w:r>
+        <w:t xml:space="preserve">Total voltage across the setup </w:t>
+      </w:r>
+      <w:bookmarkStart w:id="0" w:name="_GoBack"/>
+      <w:bookmarkEnd w:id="0"/>
+      <w:r>
+        <w:t>: 22V (5V + 5V + 12V).</w:t>
+      </w:r>
+    </w:p>
     <w:sectPr>
       <w:pgSz w:w="12240" w:h="15840"/>
       <w:pgMar w:top="1440" w:right="1800" w:bottom="1440" w:left="1800" w:header="720" w:footer="720" w:gutter="0"/>
@@ -12387,7 +12461,7 @@
 </file>
 
 <file path=customXml/itemProps1.xml><?xml version="1.0" encoding="utf-8"?>
-<ds:datastoreItem xmlns:ds="http://schemas.openxmlformats.org/officeDocument/2006/customXml" ds:itemID="{C09AE7AA-22FD-4EA5-AF52-4F382D630ED8}">
+<ds:datastoreItem xmlns:ds="http://schemas.openxmlformats.org/officeDocument/2006/customXml" ds:itemID="{F4827F65-E4D0-4D4C-8010-CB520E13358B}">
   <ds:schemaRefs>
     <ds:schemaRef ds:uri="http://schemas.openxmlformats.org/officeDocument/2006/bibliography"/>
   </ds:schemaRefs>

</xml_diff>